<commit_message>
feat(team): add Viren as Head of Marketing across site, 3D card, and print docs
</commit_message>
<xml_diff>
--- a/Pickle-Corp-Business-Card-Print-Order.docx
+++ b/Pickle-Corp-Business-Card-Print-Order.docx
@@ -50,7 +50,7 @@
           <w:color w:val="656D4A"/>
           <w:sz w:val="19"/>
         </w:rPr>
-        <w:t>Client: Azan Abdullah &amp; Thanvi (Age 14)  •  Studio: Pickle Corp™  •  Favors over Fiat ($0.00)</w:t>
+        <w:t>Founders: Azan Abdullah, Thanvi &amp; Viren (Age 14)  •  Studio: Pickle Corp™  •  Favors over Fiat ($0.00)</w:t>
       </w:r>
     </w:p>
     <w:p>
@@ -806,7 +806,7 @@
           <w:rFonts w:ascii="Arial" w:hAnsi="Arial"/>
           <w:sz w:val="19"/>
         </w:rPr>
-        <w:t>• Founder Names: Azan &amp; Thanvi</w:t>
+        <w:t>• Founder Names: Azan, Thanvi &amp; Viren</w:t>
         <w:br/>
       </w:r>
       <w:r>
@@ -814,7 +814,7 @@
           <w:rFonts w:ascii="Arial" w:hAnsi="Arial"/>
           <w:sz w:val="19"/>
         </w:rPr>
-        <w:t>• Focus: Systems Architecture • Product Aesthetics</w:t>
+        <w:t>• Focus: Systems • Aesthetics • Marketing</w:t>
         <w:br/>
       </w:r>
       <w:r>
@@ -853,7 +853,7 @@
           <w:rFonts w:ascii="Arial" w:hAnsi="Arial"/>
           <w:sz w:val="19"/>
         </w:rPr>
-        <w:t>• Covenant Text: “The bearer holds a direct promissory marker for production software engineering or design execution by Azan &amp; Thanvi. In accordance with the Barter Law, cash is declined. You owe us one solid favor called in when we find ourselves in a pickle. The ledger never forgets.”</w:t>
+        <w:t>• Covenant Text: “The bearer holds a direct promissory marker for production software engineering, design execution, or marketing launch by Azan, Thanvi &amp; Viren. In accordance with the Barter Law, cash is declined. You owe us one solid favor called in when we find ourselves in a pickle. The ledger never forgets.”</w:t>
         <w:br/>
       </w:r>
       <w:r>
@@ -893,7 +893,7 @@
           <w:rFonts w:ascii="Arial" w:hAnsi="Arial"/>
           <w:sz w:val="19"/>
         </w:rPr>
-        <w:t>• Accepted Trades: Pizza, Steam games, brownies, hard problems</w:t>
+        <w:t>• Accepted Trades: Pizza, Steam games, brownies, burgers, viral launches</w:t>
         <w:br/>
       </w:r>
       <w:r>
@@ -901,7 +901,7 @@
           <w:rFonts w:ascii="Arial" w:hAnsi="Arial"/>
           <w:sz w:val="19"/>
         </w:rPr>
-        <w:t>• Signatures: Systems: Azan Abdullah  |  Aesthetics: Thanvi  |  Status: Banked ✦</w:t>
+        <w:t>• Signatures: Systems: Azan  |  Aesthetics: Thanvi  |  Marketing: Viren  |  Status: Banked ✦</w:t>
         <w:br/>
       </w:r>
     </w:p>
@@ -1377,7 +1377,7 @@
           <w:color w:val="333D29"/>
           <w:sz w:val="19"/>
         </w:rPr>
-        <w:t>• Primary Contact: Azan Abdullah &amp; Thanvi (Pickle Corp™)</w:t>
+        <w:t>• Primary Contact: Azan Abdullah, Thanvi &amp; Viren (Pickle Corp™)</w:t>
         <w:br/>
       </w:r>
       <w:r>
@@ -1404,7 +1404,7 @@
           <w:color w:val="333D29"/>
           <w:sz w:val="19"/>
         </w:rPr>
-        <w:t>• Live Web Proof: https://azanabdullah2752012-ui.github.io/pickle-corp/card.html</w:t>
+        <w:t>• Live Web Proof: https://azanabdullah2752012-ui.github.io/pickle-corp/#card</w:t>
         <w:br/>
       </w:r>
     </w:p>

</xml_diff>

<commit_message>
fix(team): clarify Azan & Thanvi as founders with Viren heading marketing without equity details
</commit_message>
<xml_diff>
--- a/Pickle-Corp-Business-Card-Print-Order.docx
+++ b/Pickle-Corp-Business-Card-Print-Order.docx
@@ -50,7 +50,7 @@
           <w:color w:val="656D4A"/>
           <w:sz w:val="19"/>
         </w:rPr>
-        <w:t>Founders: Azan Abdullah, Thanvi &amp; Viren (Age 14)  •  Studio: Pickle Corp™  •  Favors over Fiat ($0.00)</w:t>
+        <w:t>Founders: Azan Abdullah &amp; Thanvi (Age 14)  •  Marketing: Viren  •  Studio: Pickle Corp™  •  Favors over Fiat ($0.00)</w:t>
       </w:r>
     </w:p>
     <w:p>
@@ -798,7 +798,7 @@
           <w:rFonts w:ascii="Arial" w:hAnsi="Arial"/>
           <w:sz w:val="19"/>
         </w:rPr>
-        <w:t>• Identity Tag: Founding Partners • Age 14</w:t>
+        <w:t>• Identity Tag: Founders • Age 14</w:t>
         <w:br/>
       </w:r>
       <w:r>
@@ -806,7 +806,7 @@
           <w:rFonts w:ascii="Arial" w:hAnsi="Arial"/>
           <w:sz w:val="19"/>
         </w:rPr>
-        <w:t>• Founder Names: Azan, Thanvi &amp; Viren</w:t>
+        <w:t>• Founder Names: Azan &amp; Thanvi</w:t>
         <w:br/>
       </w:r>
       <w:r>
@@ -814,7 +814,7 @@
           <w:rFonts w:ascii="Arial" w:hAnsi="Arial"/>
           <w:sz w:val="19"/>
         </w:rPr>
-        <w:t>• Focus: Systems • Aesthetics • Marketing</w:t>
+        <w:t>• Focus: Systems &amp; Aesthetics • Marketing: Viren</w:t>
         <w:br/>
       </w:r>
       <w:r>
@@ -853,7 +853,7 @@
           <w:rFonts w:ascii="Arial" w:hAnsi="Arial"/>
           <w:sz w:val="19"/>
         </w:rPr>
-        <w:t>• Covenant Text: “The bearer holds a direct promissory marker for production software engineering, design execution, or marketing launch by Azan, Thanvi &amp; Viren. In accordance with the Barter Law, cash is declined. You owe us one solid favor called in when we find ourselves in a pickle. The ledger never forgets.”</w:t>
+        <w:t>• Covenant Text: “The bearer holds a direct promissory marker for production software engineering or design execution by Azan &amp; Thanvi, with marketing launch by Viren. In accordance with the Barter Law, cash is declined. You owe us one solid favor called in when we find ourselves in a pickle. The ledger never forgets.”</w:t>
         <w:br/>
       </w:r>
       <w:r>
@@ -1377,7 +1377,7 @@
           <w:color w:val="333D29"/>
           <w:sz w:val="19"/>
         </w:rPr>
-        <w:t>• Primary Contact: Azan Abdullah, Thanvi &amp; Viren (Pickle Corp™)</w:t>
+        <w:t>• Primary Contact: Azan Abdullah &amp; Thanvi (Founders) • Viren (Marketing)</w:t>
         <w:br/>
       </w:r>
       <w:r>

</xml_diff>

<commit_message>
feat(card): add Viren to front headline of business card (Azan, Thanvi & Viren)
</commit_message>
<xml_diff>
--- a/Pickle-Corp-Business-Card-Print-Order.docx
+++ b/Pickle-Corp-Business-Card-Print-Order.docx
@@ -50,7 +50,7 @@
           <w:color w:val="656D4A"/>
           <w:sz w:val="19"/>
         </w:rPr>
-        <w:t>Founders: Azan Abdullah &amp; Thanvi (Age 14)  •  Marketing: Viren  •  Studio: Pickle Corp™  •  Favors over Fiat ($0.00)</w:t>
+        <w:t>Founders: Azan Abdullah, Thanvi &amp; Viren (Age 14)  •  Studio: Pickle Corp™  •  Favors over Fiat ($0.00)</w:t>
       </w:r>
     </w:p>
     <w:p>
@@ -806,7 +806,7 @@
           <w:rFonts w:ascii="Arial" w:hAnsi="Arial"/>
           <w:sz w:val="19"/>
         </w:rPr>
-        <w:t>• Founder Names: Azan &amp; Thanvi</w:t>
+        <w:t>• Founder Names: Azan, Thanvi &amp; Viren</w:t>
         <w:br/>
       </w:r>
       <w:r>
@@ -814,7 +814,7 @@
           <w:rFonts w:ascii="Arial" w:hAnsi="Arial"/>
           <w:sz w:val="19"/>
         </w:rPr>
-        <w:t>• Focus: Systems &amp; Aesthetics • Marketing: Viren</w:t>
+        <w:t>• Focus: Systems • Aesthetics • Marketing</w:t>
         <w:br/>
       </w:r>
       <w:r>

</xml_diff>